<commit_message>
Study materials review: reader panel, PEMAT, content parity; simpler flyer text; per-stage narration audio
- study/reviews: content parity of sheet vs narration, PEMAT scores, simulated reader panel (pitk panel)
- Flyer EN/JA rewritten to pass the patient-education toolkit (0 errors)
- video/tts.py writes one MP3 per stage and language with Kokoro-82M; JA speed 1.1 and shorter gaps keep each under 45 s
- Narration stage 1 explains 'cleft'; setup guide names FORM_EN/FORM_JA in tools/build.py

Co-Authored-By: Claude Opus 5.5 (1M context) <noreply@anthropic.com>
Claude-Session: https://claude.ai/code/session_01FmEXckkZCHeetJEUVKh7mV
</commit_message>
<xml_diff>
--- a/study/narration/narration-script-EN-JA.docx
+++ b/study/narration/narration-script-EN-JA.docx
@@ -63,7 +63,7 @@
           <w:color w:val="56636F"/>
           <w:sz w:val="18"/>
         </w:rPr>
-        <w:t>English: 112 words, about 45 s.   日本語：226字、約41秒。</w:t>
+        <w:t>English: 112 words, about 45 s.   日本語：238字、約43秒。</w:t>
       </w:r>
     </w:p>
     <w:tbl>
@@ -166,7 +166,7 @@
               <w:rPr>
                 <w:b w:val="0"/>
               </w:rPr>
-              <w:t>This is the upper jaw of a child, about 9 to 10 years old. The child was born with a cleft on the left side.</w:t>
+              <w:t>This is the upper jaw of a child, about 9 to 10 years old. The child was born with a split in the lip and gum on the left, called a cleft.</w:t>
             </w:r>
           </w:p>
         </w:tc>
@@ -180,7 +180,7 @@
               <w:rPr>
                 <w:b w:val="0"/>
               </w:rPr>
-              <w:t>これは、9～10才ごろの子どもの上あごです。生まれつき、左側に口の割れ目があります。</w:t>
+              <w:t>これは、9～10才ごろの子どもの上あごです。生まれつき、左側のくちびると歯ぐきが割れています。これを口の割れ目といいます。</w:t>
             </w:r>
           </w:p>
         </w:tc>
@@ -225,7 +225,7 @@
               <w:rPr>
                 <w:b w:val="0"/>
               </w:rPr>
-              <w:t>The pink part is the gum. Under it, there is a gap in the bone that holds the teeth.</w:t>
+              <w:t>Under the pink gum, there is a gap in the bone that holds the teeth.</w:t>
             </w:r>
           </w:p>
         </w:tc>
@@ -239,7 +239,7 @@
               <w:rPr>
                 <w:b w:val="0"/>
               </w:rPr>
-              <w:t>ピンクの部分は歯ぐきです。その下で、歯をささえる骨にすき間があります。</w:t>
+              <w:t>ピンクの歯ぐきの下で、歯をささえる骨にすき間があります。</w:t>
             </w:r>
           </w:p>
         </w:tc>
@@ -352,7 +352,7 @@
               <w:rPr>
                 <w:b w:val="0"/>
               </w:rPr>
-              <w:t>High up in the bone, the adult eye tooth waits to come down. It needs bone to grow into.</w:t>
+              <w:t>High in the bone, the adult eye tooth waits to come down. It needs bone to grow into.</w:t>
             </w:r>
           </w:p>
         </w:tc>
@@ -411,7 +411,7 @@
               <w:rPr>
                 <w:b w:val="0"/>
               </w:rPr>
-              <w:t>So, at about 8 to 11 years old, a surgeon fills the gap with bone, most often from the hip. This is called a bone graft.</w:t>
+              <w:t>At about 8 to 11 years old, a surgeon fills the gap with bone, most often from the hip. This is a bone graft.</w:t>
             </w:r>
           </w:p>
         </w:tc>

</xml_diff>

<commit_message>
Narration limit 60 s per stage (Luke: fixed 60 s per material per stage)
Co-Authored-By: Claude Opus 5.5 (1M context) <noreply@anthropic.com>
Claude-Session: https://claude.ai/code/session_01FmEXckkZCHeetJEUVKh7mV
</commit_message>
<xml_diff>
--- a/study/narration/narration-script-EN-JA.docx
+++ b/study/narration/narration-script-EN-JA.docx
@@ -23,7 +23,7 @@
           <w:b w:val="0"/>
           <w:i w:val="0"/>
         </w:rPr>
-        <w:t>Version 0.1, 22 October 2026. One part per stage, each spoken in 45 seconds or less by a computer voice (English bf_emma, Japanese jf_alpha, Kokoro-82M, as in the wisdom tooth study). With the 3D printed model it plays as audio only from the study device. The narrated video shows the same words as subtitles and the line labels in the right column, with the same names as the AR web page and the 2D information sheet. Track Changes is on: please type edits and add comments directly.</w:t>
+        <w:t>Version 0.1, 22 October 2026. One part per stage, each spoken in 60 seconds or less by a computer voice (English bf_emma, Japanese jf_alpha, Kokoro-82M, as in the wisdom tooth study). With the 3D printed model it plays as audio only from the study device. The narrated video shows the same words as subtitles and the line labels in the right column, with the same names as the AR web page and the 2D information sheet. Track Changes is on: please type edits and add comments directly.</w:t>
       </w:r>
     </w:p>
     <w:p>
@@ -37,7 +37,7 @@
           <w:color w:val="56636F"/>
           <w:sz w:val="18"/>
         </w:rPr>
-        <w:t>Every sentence comes from, or shortens, the web page text for that stage (cbct-2026.github.io/ABG), with the same sources. To fit 45 seconds, it leaves out: the medical names (alveolar cleft, agenesis, lateral incisor), the list of reasons for the graft, the best root stage for timing, wound opening, the return to school, and the details of each choice for the missing tooth. Source text: content/narration.md in the ABG repo.</w:t>
+        <w:t>Every sentence comes from, or shortens, the web page text for that stage (cbct-2026.github.io/ABG), with the same sources. To fit 60 seconds, it leaves out: the medical names (alveolar cleft, agenesis, lateral incisor), the list of reasons for the graft, the best root stage for timing, wound opening, the return to school, and the details of each choice for the missing tooth. Source text: content/narration.md in the ABG repo.</w:t>
       </w:r>
     </w:p>
     <w:p>

</xml_diff>

<commit_message>
Lengthen narration to use the 60 s per stage
Adds back points the 45 s version left out: the medical name alveolar cleft, graft aims, wound opening, return to school, braces for almost everyone, tooth-coloured filling, implant and bridge explained. Audio re-made: EN 42-44 s, JA 50-56 s.

Co-Authored-By: Claude Opus 5.5 (1M context) <noreply@anthropic.com>
Claude-Session: https://claude.ai/code/session_01FmEXckkZCHeetJEUVKh7mV
</commit_message>
<xml_diff>
--- a/study/narration/narration-script-EN-JA.docx
+++ b/study/narration/narration-script-EN-JA.docx
@@ -23,7 +23,7 @@
           <w:b w:val="0"/>
           <w:i w:val="0"/>
         </w:rPr>
-        <w:t>Version 0.1, 22 October 2026. One part per stage, each spoken in 60 seconds or less by a computer voice (English bf_emma, Japanese jf_alpha, Kokoro-82M, as in the wisdom tooth study). With the 3D printed model it plays as audio only from the study device. The narrated video shows the same words as subtitles and the line labels in the right column, with the same names as the AR web page and the 2D information sheet. Track Changes is on: please type edits and add comments directly.</w:t>
+        <w:t>Version 0.2, 22 October 2026. One part per stage, each spoken in 60 seconds or less by a computer voice (English bf_emma, Japanese jf_alpha, Kokoro-82M, as in the wisdom tooth study). With the 3D printed model it plays as audio only from the study device. The narrated video shows the same words as subtitles and the line labels in the right column, with the same names as the AR web page and the 2D information sheet. Track Changes is on: please type edits and add comments directly.</w:t>
       </w:r>
     </w:p>
     <w:p>
@@ -37,7 +37,7 @@
           <w:color w:val="56636F"/>
           <w:sz w:val="18"/>
         </w:rPr>
-        <w:t>Every sentence comes from, or shortens, the web page text for that stage (cbct-2026.github.io/ABG), with the same sources. To fit 60 seconds, it leaves out: the medical names (alveolar cleft, agenesis, lateral incisor), the list of reasons for the graft, the best root stage for timing, wound opening, the return to school, and the details of each choice for the missing tooth. Source text: content/narration.md in the ABG repo.</w:t>
+        <w:t>Every sentence comes from, or shortens, the web page text for that stage (cbct-2026.github.io/ABG), with the same sources. Measured with the computer voice: English 42 to 44 s, Japanese 50 to 56 s per stage. To fit 60 seconds, it leaves out: the medical names agenesis and lateral incisor, the best root stage for timing, the stitches, and the removable plate details. Source text: content/narration.md in the ABG repo.</w:t>
       </w:r>
     </w:p>
     <w:p>
@@ -63,7 +63,7 @@
           <w:color w:val="56636F"/>
           <w:sz w:val="18"/>
         </w:rPr>
-        <w:t>English: 112 words, about 45 s.   日本語：238字、約43秒。</w:t>
+        <w:t>English: 136 words, about 54 s.   日本語：280字、約51秒。</w:t>
       </w:r>
     </w:p>
     <w:tbl>
@@ -225,7 +225,7 @@
               <w:rPr>
                 <w:b w:val="0"/>
               </w:rPr>
-              <w:t>Under the pink gum, there is a gap in the bone that holds the teeth.</w:t>
+              <w:t>Under the pink gum, there is a gap in the bone that holds the teeth. Its medical name is the alveolar cleft.</w:t>
             </w:r>
           </w:p>
         </w:tc>
@@ -239,7 +239,7 @@
               <w:rPr>
                 <w:b w:val="0"/>
               </w:rPr>
-              <w:t>ピンクの歯ぐきの下で、歯をささえる骨にすき間があります。</w:t>
+              <w:t>ピンクの歯ぐきの下で、歯をささえる骨にすき間があります。医学の名前は、がくれつです。</w:t>
             </w:r>
           </w:p>
         </w:tc>
@@ -411,7 +411,7 @@
               <w:rPr>
                 <w:b w:val="0"/>
               </w:rPr>
-              <w:t>At about 8 to 11 years old, a surgeon fills the gap with bone, most often from the hip. This is a bone graft.</w:t>
+              <w:t>At about 8 to 11 years old, a surgeon fills the gap with bone, most often from the hip. This is a bone graft. It joins the jaw, holds up the teeth and nose, and closes any hole into the nose.</w:t>
             </w:r>
           </w:p>
         </w:tc>
@@ -425,7 +425,7 @@
               <w:rPr>
                 <w:b w:val="0"/>
               </w:rPr>
-              <w:t>そこで8～11才ごろに、外科医が、多くの場合こしの骨をとって、すき間をうめます。これを骨移植といいます。</w:t>
+              <w:t>そこで8～11才ごろに、外科医が、多くの場合こしの骨をとって、すき間をうめます。これを骨移植といいます。上あごをつなぎ、歯と鼻をささえ、鼻へのあなをふさぎます。</w:t>
             </w:r>
           </w:p>
         </w:tc>
@@ -469,7 +469,7 @@
           <w:color w:val="56636F"/>
           <w:sz w:val="18"/>
         </w:rPr>
-        <w:t>English: 103 words, about 41 s.   日本語：235字、約43秒。</w:t>
+        <w:t>English: 129 words, about 52 s.   日本語：296字、約54秒。</w:t>
       </w:r>
     </w:p>
     <w:tbl>
@@ -631,7 +631,7 @@
               <w:rPr>
                 <w:b w:val="0"/>
               </w:rPr>
-              <w:t>New bone now fills the gap, from the floor of the nose down to the gum. It joins the two parts of the upper jaw. The gum has healed over it.</w:t>
+              <w:t>New bone now fills the gap, from the floor of the nose down to the gum. It joins the two parts of the upper jaw. The gum has healed over it. If the wound opens early on, you can lose some of the graft.</w:t>
             </w:r>
           </w:p>
         </w:tc>
@@ -645,7 +645,7 @@
               <w:rPr>
                 <w:b w:val="0"/>
               </w:rPr>
-              <w:t>新しい骨が、鼻のそこから歯ぐきまで、すき間をうめています。上あごの2つの部分をつないでいます。その上の歯ぐきは治っています。</w:t>
+              <w:t>新しい骨が、鼻のそこから歯ぐきまで、すき間をうめています。上あごの2つの部分をつないでいます。その上の歯ぐきは治っています。手術のすぐ後に傷が開くと、移植した骨が少しへることがあります。</w:t>
             </w:r>
           </w:p>
         </w:tc>
@@ -808,7 +808,7 @@
               <w:rPr>
                 <w:b w:val="0"/>
               </w:rPr>
-              <w:t>Your hip can be sore for a while after surgery.</w:t>
+              <w:t>Your hip can be sore for a while after surgery. In one study, children went back to school about 2 weeks after surgery.</w:t>
             </w:r>
           </w:p>
         </w:tc>
@@ -822,7 +822,7 @@
               <w:rPr>
                 <w:b w:val="0"/>
               </w:rPr>
-              <w:t>骨をとったこしは、手術の後しばらくいたむことがあります。</w:t>
+              <w:t>骨をとったこしは、手術の後しばらくいたむことがあります。ある研究では、子どもは手術の約2週間後に学校にもどりました。</w:t>
             </w:r>
           </w:p>
         </w:tc>
@@ -866,7 +866,7 @@
           <w:color w:val="56636F"/>
           <w:sz w:val="18"/>
         </w:rPr>
-        <w:t>English: 105 words, about 42 s.   日本語：242字、約44秒。</w:t>
+        <w:t>English: 139 words, about 56 s.   日本語：321字、約58秒。</w:t>
       </w:r>
     </w:p>
     <w:tbl>
@@ -1096,7 +1096,7 @@
               <w:rPr>
                 <w:b w:val="0"/>
               </w:rPr>
-              <w:t>Fixed braces line up the teeth.</w:t>
+              <w:t>Fixed braces line up the teeth. Almost everyone who has this graft needs them.</w:t>
             </w:r>
           </w:p>
         </w:tc>
@@ -1110,7 +1110,7 @@
               <w:rPr>
                 <w:b w:val="0"/>
               </w:rPr>
-              <w:t>歯につける装置で、歯をならべます。</w:t>
+              <w:t>歯につける装置で、歯をならべます。この手術を受けた人のほとんどが、この装置を使います。</w:t>
             </w:r>
           </w:p>
         </w:tc>
@@ -1155,7 +1155,7 @@
               <w:rPr>
                 <w:b w:val="0"/>
               </w:rPr>
-              <w:t>The tooth that never grew leaves a gap. Often, braces move the eye tooth into the gap, and the dentist reshapes it. Or you keep the gap, with a false tooth on a plate you can take out. When you stop growing, an implant or a bridge can fill it. Your cleft team will help you choose.</w:t>
+              <w:t>The tooth that never grew leaves a gap. Often, braces move the eye tooth into the gap, and the dentist reshapes it with tooth-coloured filling. Or you keep the gap, with a false tooth on a plate you can take out. When you stop growing, an implant or a bridge can fill it. An implant is a small post with a false tooth on top. A bridge is a false tooth glued to the next tooth. Your cleft team will help you choose.</w:t>
             </w:r>
           </w:p>
         </w:tc>
@@ -1169,7 +1169,7 @@
               <w:rPr>
                 <w:b w:val="0"/>
               </w:rPr>
-              <w:t>はえてこなかった歯の所には、すき間がのこります。多くは、装置で犬歯をすき間に動かし、形を整えます。すき間をのこして、取り外しできる入れ歯を使うこともあります。体が育ち終わったら、インプラントかブリッジでうめられます。どの方法が合うかは、口の割れ目のチームと話し合います。</w:t>
+              <w:t>はえてこなかった歯の所には、すき間がのこります。多くは、装置で犬歯をすき間に動かし、歯の色のつめもので形を整えます。すき間をのこして、取り外しできる入れ歯を使うこともあります。体が育ち終わったら、インプラントかブリッジでうめられます。インプラントは、骨に入れた小さな柱に歯をつけます。ブリッジは、となりの歯に歯をつけます。どの方法が合うかは、口の割れ目のチームと話し合います。</w:t>
             </w:r>
           </w:p>
         </w:tc>

</xml_diff>